<commit_message>
Site updated: 2022-08-24 14:15:55
</commit_message>
<xml_diff>
--- a/treasure/download/典籍/能断金刚般若波罗蜜多经-玄奘.docx
+++ b/treasure/download/典籍/能断金刚般若波罗蜜多经-玄奘.docx
@@ -10,7 +10,6 @@
           <w:szCs w:val="24"/>
         </w:rPr>
       </w:pPr>
-      <w:bookmarkStart w:id="0" w:name="_GoBack"/>
       <w:r>
         <w:rPr>
           <w:rFonts w:ascii="楷体" w:eastAsia="楷体" w:hAnsi="楷体"/>
@@ -35,39 +34,6 @@
           <w:szCs w:val="24"/>
         </w:rPr>
         <w:t>能断金刚般若波罗蜜多经</w:t>
-      </w:r>
-    </w:p>
-    <w:p>
-      <w:pPr>
-        <w:rPr>
-          <w:rFonts w:ascii="楷体" w:eastAsia="楷体" w:hAnsi="楷体"/>
-          <w:sz w:val="24"/>
-          <w:szCs w:val="24"/>
-        </w:rPr>
-      </w:pPr>
-      <w:r>
-        <w:rPr>
-          <w:rFonts w:ascii="楷体" w:eastAsia="楷体" w:hAnsi="楷体" w:hint="eastAsia"/>
-          <w:sz w:val="24"/>
-          <w:szCs w:val="24"/>
-        </w:rPr>
-        <w:t>唐三藏法师玄奘奉</w:t>
-      </w:r>
-      <w:r>
-        <w:rPr>
-          <w:rFonts w:ascii="楷体" w:eastAsia="楷体" w:hAnsi="楷体" w:hint="eastAsia"/>
-          <w:sz w:val="24"/>
-          <w:szCs w:val="24"/>
-        </w:rPr>
-        <w:t xml:space="preserve"> </w:t>
-      </w:r>
-      <w:r>
-        <w:rPr>
-          <w:rFonts w:ascii="楷体" w:eastAsia="楷体" w:hAnsi="楷体" w:hint="eastAsia"/>
-          <w:sz w:val="24"/>
-          <w:szCs w:val="24"/>
-        </w:rPr>
-        <w:t>诏译</w:t>
       </w:r>
     </w:p>
     <w:p>
@@ -85,6 +51,40 @@
           <w:sz w:val="24"/>
           <w:szCs w:val="24"/>
         </w:rPr>
+        <w:t>唐三藏法师玄奘奉</w:t>
+      </w:r>
+      <w:r>
+        <w:rPr>
+          <w:rFonts w:ascii="楷体" w:eastAsia="楷体" w:hAnsi="楷体" w:hint="eastAsia"/>
+          <w:sz w:val="24"/>
+          <w:szCs w:val="24"/>
+        </w:rPr>
+        <w:t xml:space="preserve"> </w:t>
+      </w:r>
+      <w:r>
+        <w:rPr>
+          <w:rFonts w:ascii="楷体" w:eastAsia="楷体" w:hAnsi="楷体" w:hint="eastAsia"/>
+          <w:sz w:val="24"/>
+          <w:szCs w:val="24"/>
+        </w:rPr>
+        <w:t>诏译</w:t>
+      </w:r>
+    </w:p>
+    <w:p>
+      <w:pPr>
+        <w:ind w:firstLineChars="200" w:firstLine="480"/>
+        <w:rPr>
+          <w:rFonts w:ascii="楷体" w:eastAsia="楷体" w:hAnsi="楷体"/>
+          <w:sz w:val="24"/>
+          <w:szCs w:val="24"/>
+        </w:rPr>
+      </w:pPr>
+      <w:r>
+        <w:rPr>
+          <w:rFonts w:ascii="楷体" w:eastAsia="楷体" w:hAnsi="楷体" w:hint="eastAsia"/>
+          <w:sz w:val="24"/>
+          <w:szCs w:val="24"/>
+        </w:rPr>
         <w:t>如是我闻</w:t>
       </w:r>
       <w:r>
@@ -109,7 +109,23 @@
           <w:sz w:val="24"/>
           <w:szCs w:val="24"/>
         </w:rPr>
-        <w:t>薄伽梵在室罗筏住誓多林给孤独园</w:t>
+        <w:t>薄伽梵在室罗筏</w:t>
+      </w:r>
+      <w:r>
+        <w:rPr>
+          <w:rFonts w:ascii="楷体" w:eastAsia="楷体" w:hAnsi="楷体" w:hint="eastAsia"/>
+          <w:sz w:val="24"/>
+          <w:szCs w:val="24"/>
+        </w:rPr>
+        <w:t>。</w:t>
+      </w:r>
+      <w:r>
+        <w:rPr>
+          <w:rFonts w:ascii="楷体" w:eastAsia="楷体" w:hAnsi="楷体" w:hint="eastAsia"/>
+          <w:sz w:val="24"/>
+          <w:szCs w:val="24"/>
+        </w:rPr>
+        <w:t>住誓多林给孤独园</w:t>
       </w:r>
       <w:r>
         <w:rPr>
@@ -189,6 +205,14 @@
           <w:sz w:val="24"/>
           <w:szCs w:val="24"/>
         </w:rPr>
+        <w:t>。</w:t>
+      </w:r>
+      <w:r>
+        <w:rPr>
+          <w:rFonts w:ascii="楷体" w:eastAsia="楷体" w:hAnsi="楷体" w:hint="eastAsia"/>
+          <w:sz w:val="24"/>
+          <w:szCs w:val="24"/>
+        </w:rPr>
         <w:t>执持衣钵</w:t>
       </w:r>
       <w:r>
@@ -229,15 +253,55 @@
           <w:sz w:val="24"/>
           <w:szCs w:val="24"/>
         </w:rPr>
-        <w:t>行乞食已出还本处。</w:t>
-      </w:r>
-      <w:r>
-        <w:rPr>
-          <w:rFonts w:ascii="楷体" w:eastAsia="楷体" w:hAnsi="楷体" w:hint="eastAsia"/>
-          <w:sz w:val="24"/>
-          <w:szCs w:val="24"/>
-        </w:rPr>
-        <w:t>饭食讫收衣钵</w:t>
+        <w:t>行乞食已</w:t>
+      </w:r>
+      <w:r>
+        <w:rPr>
+          <w:rFonts w:ascii="楷体" w:eastAsia="楷体" w:hAnsi="楷体" w:hint="eastAsia"/>
+          <w:sz w:val="24"/>
+          <w:szCs w:val="24"/>
+        </w:rPr>
+        <w:t>。</w:t>
+      </w:r>
+      <w:r>
+        <w:rPr>
+          <w:rFonts w:ascii="楷体" w:eastAsia="楷体" w:hAnsi="楷体" w:hint="eastAsia"/>
+          <w:sz w:val="24"/>
+          <w:szCs w:val="24"/>
+        </w:rPr>
+        <w:t>出还本处。</w:t>
+      </w:r>
+      <w:r>
+        <w:rPr>
+          <w:rFonts w:ascii="楷体" w:eastAsia="楷体" w:hAnsi="楷体" w:hint="eastAsia"/>
+          <w:sz w:val="24"/>
+          <w:szCs w:val="24"/>
+        </w:rPr>
+        <w:t>饭食讫</w:t>
+      </w:r>
+      <w:r>
+        <w:rPr>
+          <w:rFonts w:ascii="楷体" w:eastAsia="楷体" w:hAnsi="楷体" w:hint="eastAsia"/>
+          <w:sz w:val="24"/>
+          <w:szCs w:val="24"/>
+        </w:rPr>
+        <w:t>。</w:t>
+      </w:r>
+      <w:r>
+        <w:rPr>
+          <w:rFonts w:ascii="楷体" w:eastAsia="楷体" w:hAnsi="楷体" w:hint="eastAsia"/>
+          <w:sz w:val="24"/>
+          <w:szCs w:val="24"/>
+        </w:rPr>
+        <w:t>收衣钵</w:t>
+      </w:r>
+      <w:r>
+        <w:rPr>
+          <w:rFonts w:ascii="楷体" w:eastAsia="楷体" w:hAnsi="楷体" w:hint="eastAsia"/>
+          <w:sz w:val="24"/>
+          <w:szCs w:val="24"/>
+        </w:rPr>
+        <w:t>。</w:t>
       </w:r>
       <w:r>
         <w:rPr>
@@ -254,6 +318,14 @@
           <w:szCs w:val="24"/>
         </w:rPr>
         <w:t>于食后时敷如常座。结跏趺坐</w:t>
+      </w:r>
+      <w:r>
+        <w:rPr>
+          <w:rFonts w:ascii="楷体" w:eastAsia="楷体" w:hAnsi="楷体" w:hint="eastAsia"/>
+          <w:sz w:val="24"/>
+          <w:szCs w:val="24"/>
+        </w:rPr>
+        <w:t>。</w:t>
       </w:r>
       <w:r>
         <w:rPr>
@@ -2259,7 +2331,55 @@
           <w:sz w:val="24"/>
           <w:szCs w:val="24"/>
         </w:rPr>
-        <w:t>后分后五百岁正法将灭时</w:t>
+        <w:t>。</w:t>
+      </w:r>
+      <w:r>
+        <w:rPr>
+          <w:rFonts w:ascii="楷体" w:eastAsia="楷体" w:hAnsi="楷体" w:hint="eastAsia"/>
+          <w:sz w:val="24"/>
+          <w:szCs w:val="24"/>
+        </w:rPr>
+        <w:t>后分</w:t>
+      </w:r>
+      <w:r>
+        <w:rPr>
+          <w:rFonts w:ascii="楷体" w:eastAsia="楷体" w:hAnsi="楷体" w:hint="eastAsia"/>
+          <w:sz w:val="24"/>
+          <w:szCs w:val="24"/>
+        </w:rPr>
+        <w:t>。</w:t>
+      </w:r>
+      <w:r>
+        <w:rPr>
+          <w:rFonts w:ascii="楷体" w:eastAsia="楷体" w:hAnsi="楷体" w:hint="eastAsia"/>
+          <w:sz w:val="24"/>
+          <w:szCs w:val="24"/>
+        </w:rPr>
+        <w:t>后五百岁</w:t>
+      </w:r>
+      <w:r>
+        <w:rPr>
+          <w:rFonts w:ascii="楷体" w:eastAsia="楷体" w:hAnsi="楷体" w:hint="eastAsia"/>
+          <w:sz w:val="24"/>
+          <w:szCs w:val="24"/>
+        </w:rPr>
+        <w:t>。</w:t>
+      </w:r>
+      <w:r>
+        <w:rPr>
+          <w:rFonts w:ascii="楷体" w:eastAsia="楷体" w:hAnsi="楷体" w:hint="eastAsia"/>
+          <w:sz w:val="24"/>
+          <w:szCs w:val="24"/>
+        </w:rPr>
+        <w:t>正法将灭时</w:t>
+      </w:r>
+      <w:r>
+        <w:rPr>
+          <w:rFonts w:ascii="楷体" w:eastAsia="楷体" w:hAnsi="楷体" w:hint="eastAsia"/>
+          <w:sz w:val="24"/>
+          <w:szCs w:val="24"/>
+        </w:rPr>
+        <w:t>。</w:t>
       </w:r>
       <w:r>
         <w:rPr>
@@ -2283,7 +2403,23 @@
           <w:sz w:val="24"/>
           <w:szCs w:val="24"/>
         </w:rPr>
-        <w:t>闻说如是色经典句生实想不</w:t>
+        <w:t>闻说如是色经典句</w:t>
+      </w:r>
+      <w:r>
+        <w:rPr>
+          <w:rFonts w:ascii="楷体" w:eastAsia="楷体" w:hAnsi="楷体" w:hint="eastAsia"/>
+          <w:sz w:val="24"/>
+          <w:szCs w:val="24"/>
+        </w:rPr>
+        <w:t>。</w:t>
+      </w:r>
+      <w:r>
+        <w:rPr>
+          <w:rFonts w:ascii="楷体" w:eastAsia="楷体" w:hAnsi="楷体" w:hint="eastAsia"/>
+          <w:sz w:val="24"/>
+          <w:szCs w:val="24"/>
+        </w:rPr>
+        <w:t>生实想不</w:t>
       </w:r>
       <w:r>
         <w:rPr>
@@ -2357,6 +2493,14 @@
           <w:sz w:val="24"/>
           <w:szCs w:val="24"/>
         </w:rPr>
+        <w:t>。</w:t>
+      </w:r>
+      <w:r>
+        <w:rPr>
+          <w:rFonts w:ascii="楷体" w:eastAsia="楷体" w:hAnsi="楷体" w:hint="eastAsia"/>
+          <w:sz w:val="24"/>
+          <w:szCs w:val="24"/>
+        </w:rPr>
         <w:t>后时</w:t>
       </w:r>
       <w:r>
@@ -2381,7 +2525,23 @@
           <w:sz w:val="24"/>
           <w:szCs w:val="24"/>
         </w:rPr>
-        <w:t>五百岁正法将灭时分转时闻说如是色经典句</w:t>
+        <w:t>五百岁正法将灭时分转时</w:t>
+      </w:r>
+      <w:r>
+        <w:rPr>
+          <w:rFonts w:ascii="楷体" w:eastAsia="楷体" w:hAnsi="楷体" w:hint="eastAsia"/>
+          <w:sz w:val="24"/>
+          <w:szCs w:val="24"/>
+        </w:rPr>
+        <w:t>。</w:t>
+      </w:r>
+      <w:r>
+        <w:rPr>
+          <w:rFonts w:ascii="楷体" w:eastAsia="楷体" w:hAnsi="楷体" w:hint="eastAsia"/>
+          <w:sz w:val="24"/>
+          <w:szCs w:val="24"/>
+        </w:rPr>
+        <w:t>闻说如是色经典句</w:t>
       </w:r>
       <w:r>
         <w:rPr>
@@ -3300,6 +3460,14 @@
           <w:sz w:val="24"/>
           <w:szCs w:val="24"/>
         </w:rPr>
+        <w:t>。</w:t>
+      </w:r>
+      <w:r>
+        <w:rPr>
+          <w:rFonts w:ascii="楷体" w:eastAsia="楷体" w:hAnsi="楷体" w:hint="eastAsia"/>
+          <w:sz w:val="24"/>
+          <w:szCs w:val="24"/>
+        </w:rPr>
         <w:t>何况非法</w:t>
       </w:r>
       <w:r>
@@ -3600,7 +3768,31 @@
           <w:sz w:val="24"/>
           <w:szCs w:val="24"/>
         </w:rPr>
-        <w:t>所证所说</w:t>
+        <w:t>所证</w:t>
+      </w:r>
+      <w:r>
+        <w:rPr>
+          <w:rFonts w:ascii="楷体" w:eastAsia="楷体" w:hAnsi="楷体" w:hint="eastAsia"/>
+          <w:sz w:val="24"/>
+          <w:szCs w:val="24"/>
+        </w:rPr>
+        <w:t>、</w:t>
+      </w:r>
+      <w:r>
+        <w:rPr>
+          <w:rFonts w:ascii="楷体" w:eastAsia="楷体" w:hAnsi="楷体" w:hint="eastAsia"/>
+          <w:sz w:val="24"/>
+          <w:szCs w:val="24"/>
+        </w:rPr>
+        <w:t>所说</w:t>
+      </w:r>
+      <w:r>
+        <w:rPr>
+          <w:rFonts w:ascii="楷体" w:eastAsia="楷体" w:hAnsi="楷体" w:hint="eastAsia"/>
+          <w:sz w:val="24"/>
+          <w:szCs w:val="24"/>
+        </w:rPr>
+        <w:t>、</w:t>
       </w:r>
       <w:r>
         <w:rPr>
@@ -4402,7 +4594,71 @@
           <w:sz w:val="24"/>
           <w:szCs w:val="24"/>
         </w:rPr>
-        <w:t>若预流者作如是念。我能证得预流之果。即为执我有情命者士夫补特伽罗等。</w:t>
+        <w:t>若预流者作如是念。我能证得预流之果。即为执我</w:t>
+      </w:r>
+      <w:r>
+        <w:rPr>
+          <w:rFonts w:ascii="楷体" w:eastAsia="楷体" w:hAnsi="楷体" w:hint="eastAsia"/>
+          <w:sz w:val="24"/>
+          <w:szCs w:val="24"/>
+        </w:rPr>
+        <w:t>、</w:t>
+      </w:r>
+      <w:r>
+        <w:rPr>
+          <w:rFonts w:ascii="楷体" w:eastAsia="楷体" w:hAnsi="楷体" w:hint="eastAsia"/>
+          <w:sz w:val="24"/>
+          <w:szCs w:val="24"/>
+        </w:rPr>
+        <w:t>有情</w:t>
+      </w:r>
+      <w:r>
+        <w:rPr>
+          <w:rFonts w:ascii="楷体" w:eastAsia="楷体" w:hAnsi="楷体" w:hint="eastAsia"/>
+          <w:sz w:val="24"/>
+          <w:szCs w:val="24"/>
+        </w:rPr>
+        <w:t>、</w:t>
+      </w:r>
+      <w:r>
+        <w:rPr>
+          <w:rFonts w:ascii="楷体" w:eastAsia="楷体" w:hAnsi="楷体" w:hint="eastAsia"/>
+          <w:sz w:val="24"/>
+          <w:szCs w:val="24"/>
+        </w:rPr>
+        <w:t>命者</w:t>
+      </w:r>
+      <w:r>
+        <w:rPr>
+          <w:rFonts w:ascii="楷体" w:eastAsia="楷体" w:hAnsi="楷体" w:hint="eastAsia"/>
+          <w:sz w:val="24"/>
+          <w:szCs w:val="24"/>
+        </w:rPr>
+        <w:t>、</w:t>
+      </w:r>
+      <w:r>
+        <w:rPr>
+          <w:rFonts w:ascii="楷体" w:eastAsia="楷体" w:hAnsi="楷体" w:hint="eastAsia"/>
+          <w:sz w:val="24"/>
+          <w:szCs w:val="24"/>
+        </w:rPr>
+        <w:t>士夫</w:t>
+      </w:r>
+      <w:r>
+        <w:rPr>
+          <w:rFonts w:ascii="楷体" w:eastAsia="楷体" w:hAnsi="楷体" w:hint="eastAsia"/>
+          <w:sz w:val="24"/>
+          <w:szCs w:val="24"/>
+        </w:rPr>
+        <w:t>、</w:t>
+      </w:r>
+      <w:r>
+        <w:rPr>
+          <w:rFonts w:ascii="楷体" w:eastAsia="楷体" w:hAnsi="楷体" w:hint="eastAsia"/>
+          <w:sz w:val="24"/>
+          <w:szCs w:val="24"/>
+        </w:rPr>
+        <w:t>补特伽罗等。</w:t>
       </w:r>
     </w:p>
     <w:p>
@@ -4926,7 +5182,71 @@
           <w:sz w:val="24"/>
           <w:szCs w:val="24"/>
         </w:rPr>
-        <w:t>即为执我有情命者士夫补特伽罗等。所以者何</w:t>
+        <w:t>即为执我</w:t>
+      </w:r>
+      <w:r>
+        <w:rPr>
+          <w:rFonts w:ascii="楷体" w:eastAsia="楷体" w:hAnsi="楷体" w:hint="eastAsia"/>
+          <w:sz w:val="24"/>
+          <w:szCs w:val="24"/>
+        </w:rPr>
+        <w:t>、</w:t>
+      </w:r>
+      <w:r>
+        <w:rPr>
+          <w:rFonts w:ascii="楷体" w:eastAsia="楷体" w:hAnsi="楷体" w:hint="eastAsia"/>
+          <w:sz w:val="24"/>
+          <w:szCs w:val="24"/>
+        </w:rPr>
+        <w:t>有情</w:t>
+      </w:r>
+      <w:r>
+        <w:rPr>
+          <w:rFonts w:ascii="楷体" w:eastAsia="楷体" w:hAnsi="楷体" w:hint="eastAsia"/>
+          <w:sz w:val="24"/>
+          <w:szCs w:val="24"/>
+        </w:rPr>
+        <w:t>、</w:t>
+      </w:r>
+      <w:r>
+        <w:rPr>
+          <w:rFonts w:ascii="楷体" w:eastAsia="楷体" w:hAnsi="楷体" w:hint="eastAsia"/>
+          <w:sz w:val="24"/>
+          <w:szCs w:val="24"/>
+        </w:rPr>
+        <w:t>命者</w:t>
+      </w:r>
+      <w:r>
+        <w:rPr>
+          <w:rFonts w:ascii="楷体" w:eastAsia="楷体" w:hAnsi="楷体" w:hint="eastAsia"/>
+          <w:sz w:val="24"/>
+          <w:szCs w:val="24"/>
+        </w:rPr>
+        <w:t>、</w:t>
+      </w:r>
+      <w:r>
+        <w:rPr>
+          <w:rFonts w:ascii="楷体" w:eastAsia="楷体" w:hAnsi="楷体" w:hint="eastAsia"/>
+          <w:sz w:val="24"/>
+          <w:szCs w:val="24"/>
+        </w:rPr>
+        <w:t>士夫</w:t>
+      </w:r>
+      <w:r>
+        <w:rPr>
+          <w:rFonts w:ascii="楷体" w:eastAsia="楷体" w:hAnsi="楷体" w:hint="eastAsia"/>
+          <w:sz w:val="24"/>
+          <w:szCs w:val="24"/>
+        </w:rPr>
+        <w:t>、</w:t>
+      </w:r>
+      <w:r>
+        <w:rPr>
+          <w:rFonts w:ascii="楷体" w:eastAsia="楷体" w:hAnsi="楷体" w:hint="eastAsia"/>
+          <w:sz w:val="24"/>
+          <w:szCs w:val="24"/>
+        </w:rPr>
+        <w:t>补特伽罗等。所以者何</w:t>
       </w:r>
       <w:r>
         <w:rPr>
@@ -5054,6 +5374,7 @@
           <w:sz w:val="24"/>
           <w:szCs w:val="24"/>
         </w:rPr>
+        <w:lastRenderedPageBreak/>
         <w:t>如来不应</w:t>
       </w:r>
       <w:r>
@@ -5062,7 +5383,6 @@
           <w:sz w:val="24"/>
           <w:szCs w:val="24"/>
         </w:rPr>
-        <w:lastRenderedPageBreak/>
         <w:t>记说我言</w:t>
       </w:r>
       <w:r>
@@ -6339,7 +6659,23 @@
           <w:sz w:val="24"/>
           <w:szCs w:val="24"/>
         </w:rPr>
-        <w:t>读诵究竟通利</w:t>
+        <w:t>读诵</w:t>
+      </w:r>
+      <w:r>
+        <w:rPr>
+          <w:rFonts w:ascii="楷体" w:eastAsia="楷体" w:hAnsi="楷体" w:hint="eastAsia"/>
+          <w:sz w:val="24"/>
+          <w:szCs w:val="24"/>
+        </w:rPr>
+        <w:t>、</w:t>
+      </w:r>
+      <w:r>
+        <w:rPr>
+          <w:rFonts w:ascii="楷体" w:eastAsia="楷体" w:hAnsi="楷体" w:hint="eastAsia"/>
+          <w:sz w:val="24"/>
+          <w:szCs w:val="24"/>
+        </w:rPr>
+        <w:t>究竟通利</w:t>
       </w:r>
       <w:r>
         <w:rPr>
@@ -6356,6 +6692,14 @@
           <w:szCs w:val="24"/>
         </w:rPr>
         <w:t>宣说开示</w:t>
+      </w:r>
+      <w:r>
+        <w:rPr>
+          <w:rFonts w:ascii="楷体" w:eastAsia="楷体" w:hAnsi="楷体" w:hint="eastAsia"/>
+          <w:sz w:val="24"/>
+          <w:szCs w:val="24"/>
+        </w:rPr>
+        <w:t>、</w:t>
       </w:r>
       <w:r>
         <w:rPr>
@@ -6469,7 +6813,23 @@
           <w:sz w:val="24"/>
           <w:szCs w:val="24"/>
         </w:rPr>
-        <w:t>此地方所尚为世间诸天及人阿素洛等之所供养</w:t>
+        <w:t>此地方所尚为世间诸天及人</w:t>
+      </w:r>
+      <w:r>
+        <w:rPr>
+          <w:rFonts w:ascii="楷体" w:eastAsia="楷体" w:hAnsi="楷体" w:hint="eastAsia"/>
+          <w:sz w:val="24"/>
+          <w:szCs w:val="24"/>
+        </w:rPr>
+        <w:t>、</w:t>
+      </w:r>
+      <w:r>
+        <w:rPr>
+          <w:rFonts w:ascii="楷体" w:eastAsia="楷体" w:hAnsi="楷体" w:hint="eastAsia"/>
+          <w:sz w:val="24"/>
+          <w:szCs w:val="24"/>
+        </w:rPr>
+        <w:t>阿素洛等之所供养</w:t>
       </w:r>
       <w:r>
         <w:rPr>
@@ -7596,6 +7956,14 @@
           <w:sz w:val="24"/>
           <w:szCs w:val="24"/>
         </w:rPr>
+        <w:t>。</w:t>
+      </w:r>
+      <w:r>
+        <w:rPr>
+          <w:rFonts w:ascii="楷体" w:eastAsia="楷体" w:hAnsi="楷体" w:hint="eastAsia"/>
+          <w:sz w:val="24"/>
+          <w:szCs w:val="24"/>
+        </w:rPr>
         <w:t>俯仰扪泪</w:t>
       </w:r>
       <w:r>
@@ -9210,6 +9578,14 @@
           <w:sz w:val="24"/>
           <w:szCs w:val="24"/>
         </w:rPr>
+        <w:t>。</w:t>
+      </w:r>
+      <w:r>
+        <w:rPr>
+          <w:rFonts w:ascii="楷体" w:eastAsia="楷体" w:hAnsi="楷体" w:hint="eastAsia"/>
+          <w:sz w:val="24"/>
+          <w:szCs w:val="24"/>
+        </w:rPr>
         <w:t>曾为自号忍辱仙人。</w:t>
       </w:r>
       <w:r>
@@ -9936,6 +10312,14 @@
           <w:sz w:val="24"/>
           <w:szCs w:val="24"/>
         </w:rPr>
+        <w:t>。</w:t>
+      </w:r>
+      <w:r>
+        <w:rPr>
+          <w:rFonts w:ascii="楷体" w:eastAsia="楷体" w:hAnsi="楷体" w:hint="eastAsia"/>
+          <w:sz w:val="24"/>
+          <w:szCs w:val="24"/>
+        </w:rPr>
         <w:t>或所思法</w:t>
       </w:r>
       <w:r>
@@ -9986,7 +10370,15 @@
           <w:sz w:val="24"/>
           <w:szCs w:val="24"/>
         </w:rPr>
-        <w:t>譬如士夫入于闇室</w:t>
+        <w:t>譬如士夫入于暗</w:t>
+      </w:r>
+      <w:r>
+        <w:rPr>
+          <w:rFonts w:ascii="楷体" w:eastAsia="楷体" w:hAnsi="楷体" w:hint="eastAsia"/>
+          <w:sz w:val="24"/>
+          <w:szCs w:val="24"/>
+        </w:rPr>
+        <w:t>室</w:t>
       </w:r>
       <w:r>
         <w:rPr>
@@ -10018,7 +10410,7 @@
           <w:sz w:val="24"/>
           <w:szCs w:val="24"/>
         </w:rPr>
-        <w:t>。</w:t>
+        <w:t>、</w:t>
       </w:r>
       <w:r>
         <w:rPr>
@@ -10058,7 +10450,31 @@
           <w:sz w:val="24"/>
           <w:szCs w:val="24"/>
         </w:rPr>
-        <w:t>过夜晓已日光出时</w:t>
+        <w:t>。</w:t>
+      </w:r>
+      <w:r>
+        <w:rPr>
+          <w:rFonts w:ascii="楷体" w:eastAsia="楷体" w:hAnsi="楷体" w:hint="eastAsia"/>
+          <w:sz w:val="24"/>
+          <w:szCs w:val="24"/>
+        </w:rPr>
+        <w:t>过夜晓已</w:t>
+      </w:r>
+      <w:r>
+        <w:rPr>
+          <w:rFonts w:ascii="楷体" w:eastAsia="楷体" w:hAnsi="楷体" w:hint="eastAsia"/>
+          <w:sz w:val="24"/>
+          <w:szCs w:val="24"/>
+        </w:rPr>
+        <w:t>。</w:t>
+      </w:r>
+      <w:r>
+        <w:rPr>
+          <w:rFonts w:ascii="楷体" w:eastAsia="楷体" w:hAnsi="楷体" w:hint="eastAsia"/>
+          <w:sz w:val="24"/>
+          <w:szCs w:val="24"/>
+        </w:rPr>
+        <w:t>日光出时</w:t>
       </w:r>
       <w:r>
         <w:rPr>
@@ -10090,7 +10506,7 @@
           <w:sz w:val="24"/>
           <w:szCs w:val="24"/>
         </w:rPr>
-        <w:t>。</w:t>
+        <w:t>、</w:t>
       </w:r>
       <w:r>
         <w:rPr>
@@ -10099,6 +10515,14 @@
           <w:szCs w:val="24"/>
         </w:rPr>
         <w:t>谓不堕事而行布施</w:t>
+      </w:r>
+      <w:r>
+        <w:rPr>
+          <w:rFonts w:ascii="楷体" w:eastAsia="楷体" w:hAnsi="楷体" w:hint="eastAsia"/>
+          <w:sz w:val="24"/>
+          <w:szCs w:val="24"/>
+        </w:rPr>
+        <w:t>。</w:t>
       </w:r>
       <w:r>
         <w:rPr>
@@ -11705,6 +12129,14 @@
           <w:sz w:val="24"/>
           <w:szCs w:val="24"/>
         </w:rPr>
+        <w:t>。</w:t>
+      </w:r>
+      <w:r>
+        <w:rPr>
+          <w:rFonts w:ascii="楷体" w:eastAsia="楷体" w:hAnsi="楷体" w:hint="eastAsia"/>
+          <w:sz w:val="24"/>
+          <w:szCs w:val="24"/>
+        </w:rPr>
         <w:t>百分计之</w:t>
       </w:r>
       <w:r>
@@ -13358,6 +13790,14 @@
           <w:sz w:val="24"/>
           <w:szCs w:val="24"/>
         </w:rPr>
+        <w:t>。</w:t>
+      </w:r>
+      <w:r>
+        <w:rPr>
+          <w:rFonts w:ascii="楷体" w:eastAsia="楷体" w:hAnsi="楷体" w:hint="eastAsia"/>
+          <w:sz w:val="24"/>
+          <w:szCs w:val="24"/>
+        </w:rPr>
         <w:t>或所思法</w:t>
       </w:r>
       <w:r>
@@ -17099,6 +17539,14 @@
           <w:sz w:val="24"/>
           <w:szCs w:val="24"/>
         </w:rPr>
+        <w:t>。</w:t>
+      </w:r>
+      <w:r>
+        <w:rPr>
+          <w:rFonts w:ascii="楷体" w:eastAsia="楷体" w:hAnsi="楷体" w:hint="eastAsia"/>
+          <w:sz w:val="24"/>
+          <w:szCs w:val="24"/>
+        </w:rPr>
         <w:t>百分计之</w:t>
       </w:r>
       <w:r>
@@ -18862,7 +19310,23 @@
           <w:sz w:val="24"/>
           <w:szCs w:val="24"/>
         </w:rPr>
-        <w:t>即以如是无数世界色像为墨如极微聚。</w:t>
+        <w:t>即以如是无数世界</w:t>
+      </w:r>
+      <w:r>
+        <w:rPr>
+          <w:rFonts w:ascii="楷体" w:eastAsia="楷体" w:hAnsi="楷体" w:hint="eastAsia"/>
+          <w:sz w:val="24"/>
+          <w:szCs w:val="24"/>
+        </w:rPr>
+        <w:t>。</w:t>
+      </w:r>
+      <w:r>
+        <w:rPr>
+          <w:rFonts w:ascii="楷体" w:eastAsia="楷体" w:hAnsi="楷体" w:hint="eastAsia"/>
+          <w:sz w:val="24"/>
+          <w:szCs w:val="24"/>
+        </w:rPr>
+        <w:t>色像为墨如极微聚。</w:t>
       </w:r>
       <w:r>
         <w:rPr>
@@ -19564,7 +20028,127 @@
           <w:sz w:val="24"/>
           <w:szCs w:val="24"/>
         </w:rPr>
-        <w:t>如来所说我见有情见命者见士夫见补特伽罗见意生见摩纳婆见作者见</w:t>
+        <w:t>如来所说我见</w:t>
+      </w:r>
+      <w:r>
+        <w:rPr>
+          <w:rFonts w:ascii="楷体" w:eastAsia="楷体" w:hAnsi="楷体" w:hint="eastAsia"/>
+          <w:sz w:val="24"/>
+          <w:szCs w:val="24"/>
+        </w:rPr>
+        <w:t>、</w:t>
+      </w:r>
+      <w:r>
+        <w:rPr>
+          <w:rFonts w:ascii="楷体" w:eastAsia="楷体" w:hAnsi="楷体" w:hint="eastAsia"/>
+          <w:sz w:val="24"/>
+          <w:szCs w:val="24"/>
+        </w:rPr>
+        <w:t>有情见</w:t>
+      </w:r>
+      <w:r>
+        <w:rPr>
+          <w:rFonts w:ascii="楷体" w:eastAsia="楷体" w:hAnsi="楷体" w:hint="eastAsia"/>
+          <w:sz w:val="24"/>
+          <w:szCs w:val="24"/>
+        </w:rPr>
+        <w:t>、</w:t>
+      </w:r>
+      <w:r>
+        <w:rPr>
+          <w:rFonts w:ascii="楷体" w:eastAsia="楷体" w:hAnsi="楷体" w:hint="eastAsia"/>
+          <w:sz w:val="24"/>
+          <w:szCs w:val="24"/>
+        </w:rPr>
+        <w:t>命者见</w:t>
+      </w:r>
+      <w:r>
+        <w:rPr>
+          <w:rFonts w:ascii="楷体" w:eastAsia="楷体" w:hAnsi="楷体" w:hint="eastAsia"/>
+          <w:sz w:val="24"/>
+          <w:szCs w:val="24"/>
+        </w:rPr>
+        <w:t>、</w:t>
+      </w:r>
+      <w:r>
+        <w:rPr>
+          <w:rFonts w:ascii="楷体" w:eastAsia="楷体" w:hAnsi="楷体" w:hint="eastAsia"/>
+          <w:sz w:val="24"/>
+          <w:szCs w:val="24"/>
+        </w:rPr>
+        <w:t>士夫见</w:t>
+      </w:r>
+      <w:r>
+        <w:rPr>
+          <w:rFonts w:ascii="楷体" w:eastAsia="楷体" w:hAnsi="楷体" w:hint="eastAsia"/>
+          <w:sz w:val="24"/>
+          <w:szCs w:val="24"/>
+        </w:rPr>
+        <w:t>、</w:t>
+      </w:r>
+      <w:r>
+        <w:rPr>
+          <w:rFonts w:ascii="楷体" w:eastAsia="楷体" w:hAnsi="楷体" w:hint="eastAsia"/>
+          <w:sz w:val="24"/>
+          <w:szCs w:val="24"/>
+        </w:rPr>
+        <w:t>补特伽罗见</w:t>
+      </w:r>
+      <w:r>
+        <w:rPr>
+          <w:rFonts w:ascii="楷体" w:eastAsia="楷体" w:hAnsi="楷体" w:hint="eastAsia"/>
+          <w:sz w:val="24"/>
+          <w:szCs w:val="24"/>
+        </w:rPr>
+        <w:t>、</w:t>
+      </w:r>
+      <w:r>
+        <w:rPr>
+          <w:rFonts w:ascii="楷体" w:eastAsia="楷体" w:hAnsi="楷体" w:hint="eastAsia"/>
+          <w:sz w:val="24"/>
+          <w:szCs w:val="24"/>
+        </w:rPr>
+        <w:t>意生见</w:t>
+      </w:r>
+      <w:r>
+        <w:rPr>
+          <w:rFonts w:ascii="楷体" w:eastAsia="楷体" w:hAnsi="楷体" w:hint="eastAsia"/>
+          <w:sz w:val="24"/>
+          <w:szCs w:val="24"/>
+        </w:rPr>
+        <w:t>、</w:t>
+      </w:r>
+      <w:r>
+        <w:rPr>
+          <w:rFonts w:ascii="楷体" w:eastAsia="楷体" w:hAnsi="楷体" w:hint="eastAsia"/>
+          <w:sz w:val="24"/>
+          <w:szCs w:val="24"/>
+        </w:rPr>
+        <w:t>摩纳婆见</w:t>
+      </w:r>
+      <w:r>
+        <w:rPr>
+          <w:rFonts w:ascii="楷体" w:eastAsia="楷体" w:hAnsi="楷体" w:hint="eastAsia"/>
+          <w:sz w:val="24"/>
+          <w:szCs w:val="24"/>
+        </w:rPr>
+        <w:t>、</w:t>
+      </w:r>
+      <w:r>
+        <w:rPr>
+          <w:rFonts w:ascii="楷体" w:eastAsia="楷体" w:hAnsi="楷体" w:hint="eastAsia"/>
+          <w:sz w:val="24"/>
+          <w:szCs w:val="24"/>
+        </w:rPr>
+        <w:t>作者见</w:t>
+      </w:r>
+      <w:r>
+        <w:rPr>
+          <w:rFonts w:ascii="楷体" w:eastAsia="楷体" w:hAnsi="楷体" w:hint="eastAsia"/>
+          <w:sz w:val="24"/>
+          <w:szCs w:val="24"/>
+        </w:rPr>
+        <w:t>、</w:t>
       </w:r>
       <w:r>
         <w:rPr>
@@ -19808,7 +20392,17 @@
           <w:sz w:val="24"/>
           <w:szCs w:val="24"/>
         </w:rPr>
-        <w:t>若菩萨摩诃萨以无量无数世界盛满七宝</w:t>
+        <w:t>若菩</w:t>
+      </w:r>
+      <w:bookmarkStart w:id="0" w:name="_GoBack"/>
+      <w:bookmarkEnd w:id="0"/>
+      <w:r>
+        <w:rPr>
+          <w:rFonts w:ascii="楷体" w:eastAsia="楷体" w:hAnsi="楷体" w:hint="eastAsia"/>
+          <w:sz w:val="24"/>
+          <w:szCs w:val="24"/>
+        </w:rPr>
+        <w:t>萨摩诃萨以无量无数世界盛满七宝</w:t>
       </w:r>
       <w:r>
         <w:rPr>
@@ -20088,7 +20682,55 @@
           <w:sz w:val="24"/>
           <w:szCs w:val="24"/>
         </w:rPr>
-        <w:t>及诸苾刍苾刍尼邬波索迦邬波斯迦</w:t>
+        <w:t>及诸苾刍</w:t>
+      </w:r>
+      <w:r>
+        <w:rPr>
+          <w:rFonts w:ascii="楷体" w:eastAsia="楷体" w:hAnsi="楷体" w:hint="eastAsia"/>
+          <w:sz w:val="24"/>
+          <w:szCs w:val="24"/>
+        </w:rPr>
+        <w:t>、</w:t>
+      </w:r>
+      <w:r>
+        <w:rPr>
+          <w:rFonts w:ascii="楷体" w:eastAsia="楷体" w:hAnsi="楷体" w:hint="eastAsia"/>
+          <w:sz w:val="24"/>
+          <w:szCs w:val="24"/>
+        </w:rPr>
+        <w:t>苾刍尼</w:t>
+      </w:r>
+      <w:r>
+        <w:rPr>
+          <w:rFonts w:ascii="楷体" w:eastAsia="楷体" w:hAnsi="楷体" w:hint="eastAsia"/>
+          <w:sz w:val="24"/>
+          <w:szCs w:val="24"/>
+        </w:rPr>
+        <w:t>、</w:t>
+      </w:r>
+      <w:r>
+        <w:rPr>
+          <w:rFonts w:ascii="楷体" w:eastAsia="楷体" w:hAnsi="楷体" w:hint="eastAsia"/>
+          <w:sz w:val="24"/>
+          <w:szCs w:val="24"/>
+        </w:rPr>
+        <w:t>邬波索迦</w:t>
+      </w:r>
+      <w:r>
+        <w:rPr>
+          <w:rFonts w:ascii="楷体" w:eastAsia="楷体" w:hAnsi="楷体" w:hint="eastAsia"/>
+          <w:sz w:val="24"/>
+          <w:szCs w:val="24"/>
+        </w:rPr>
+        <w:t>、</w:t>
+      </w:r>
+      <w:r>
+        <w:rPr>
+          <w:rFonts w:ascii="楷体" w:eastAsia="楷体" w:hAnsi="楷体" w:hint="eastAsia"/>
+          <w:sz w:val="24"/>
+          <w:szCs w:val="24"/>
+        </w:rPr>
+        <w:t>邬波斯迦</w:t>
       </w:r>
       <w:r>
         <w:rPr>
@@ -20112,7 +20754,39 @@
           <w:sz w:val="24"/>
           <w:szCs w:val="24"/>
         </w:rPr>
-        <w:t>天人阿素洛健达缚等</w:t>
+        <w:t>天人</w:t>
+      </w:r>
+      <w:r>
+        <w:rPr>
+          <w:rFonts w:ascii="楷体" w:eastAsia="楷体" w:hAnsi="楷体" w:hint="eastAsia"/>
+          <w:sz w:val="24"/>
+          <w:szCs w:val="24"/>
+        </w:rPr>
+        <w:t>、</w:t>
+      </w:r>
+      <w:r>
+        <w:rPr>
+          <w:rFonts w:ascii="楷体" w:eastAsia="楷体" w:hAnsi="楷体" w:hint="eastAsia"/>
+          <w:sz w:val="24"/>
+          <w:szCs w:val="24"/>
+        </w:rPr>
+        <w:t>阿素洛</w:t>
+      </w:r>
+      <w:r>
+        <w:rPr>
+          <w:rFonts w:ascii="楷体" w:eastAsia="楷体" w:hAnsi="楷体" w:hint="eastAsia"/>
+          <w:sz w:val="24"/>
+          <w:szCs w:val="24"/>
+        </w:rPr>
+        <w:t>、</w:t>
+      </w:r>
+      <w:r>
+        <w:rPr>
+          <w:rFonts w:ascii="楷体" w:eastAsia="楷体" w:hAnsi="楷体" w:hint="eastAsia"/>
+          <w:sz w:val="24"/>
+          <w:szCs w:val="24"/>
+        </w:rPr>
+        <w:t>健达缚等</w:t>
       </w:r>
       <w:r>
         <w:rPr>
@@ -20154,7 +20828,6 @@
         </w:rPr>
         <w:t>信受奉行。</w:t>
       </w:r>
-      <w:bookmarkEnd w:id="0"/>
     </w:p>
     <w:sectPr>
       <w:pgSz w:w="11906" w:h="16838"/>
@@ -21002,7 +21675,7 @@
 </file>
 
 <file path=customXml/itemProps1.xml><?xml version="1.0" encoding="utf-8"?>
-<ds:datastoreItem xmlns:ds="http://schemas.openxmlformats.org/officeDocument/2006/customXml" ds:itemID="{32D164AD-F500-42FA-AC36-064A508C4CC6}">
+<ds:datastoreItem xmlns:ds="http://schemas.openxmlformats.org/officeDocument/2006/customXml" ds:itemID="{D45FA6B4-A5C4-47E7-ACA6-58D3FE4150EF}">
   <ds:schemaRefs>
     <ds:schemaRef ds:uri="http://schemas.openxmlformats.org/officeDocument/2006/bibliography"/>
   </ds:schemaRefs>

</xml_diff>